<commit_message>
feat: dashboard a hypotheses figees + verdict par departement
- streamlit: retrait des curseurs d'hypotheses (valeurs fixes note de cadrage,
  affichees en clair), on garde le choix regime + puissance
- suppression du graphe cash-flow (illisible) -> verdict de rentabilite clair
- caption adaptatif expliquant le regime (autoconso rentable vs vente peu rentable)
- tableau de donnees reformate (colonnes lisibles au lieu des nombres bruts)
- README + dossier technique + pilotage: description du dashboard mise a jour
- regeneration des exports Word
</commit_message>
<xml_diff>
--- a/docs/exports/dossier-technique.docx
+++ b/docs/exports/dossier-technique.docx
@@ -12,7 +12,7 @@
           <w:color w:val="1F3B57"/>
           <w:sz w:val="44"/>
         </w:rPr>
-        <w:t>Dossier technique — Potentiel photovoltaïque tertiaire en France</w:t>
+        <w:t>Dossier technique — Workshop client Oxand</w:t>
       </w:r>
     </w:p>
     <w:p/>
@@ -224,7 +224,27 @@
         <w:t>tests/</w:t>
       </w:r>
       <w:r>
-        <w:t>), avec des hypothèses économiques centralisées et jamais codées en dur dans la logique métier, pour rester auditable et modifiable par le client sans toucher au code (curseurs du dashboard).</w:t>
+        <w:t>), avec des hypothèses économiques centralisées et jamais codées en dur dans la logique métier, pour rester auditables et facilement révisables en un seul endroit (</w:t>
+      </w:r>
+      <w:r>
+        <w:rPr>
+          <w:rFonts w:ascii="Consolas" w:hAnsi="Consolas"/>
+          <w:sz w:val="19"/>
+        </w:rPr>
+        <w:t>config.py</w:t>
+      </w:r>
+      <w:r>
+        <w:t xml:space="preserve"> / la dataclass </w:t>
+      </w:r>
+      <w:r>
+        <w:rPr>
+          <w:rFonts w:ascii="Consolas" w:hAnsi="Consolas"/>
+          <w:sz w:val="19"/>
+        </w:rPr>
+        <w:t>Assumptions</w:t>
+      </w:r>
+      <w:r>
+        <w:t>).</w:t>
       </w:r>
     </w:p>
     <w:p>
@@ -1663,7 +1683,43 @@
         <w:t>Objet</w:t>
       </w:r>
       <w:r>
-        <w:t xml:space="preserve"> : dashboard Streamlit interactif permettant à Oxand d'explorer les résultats et de rejouer les hypothèses (régime de valorisation, puissance de l'installation, OPEX, prix évité de l'autoconsommation, taux d'autoconsommation, taux d'actualisation, multiplicateur CAPEX) sans intervention sur le code, avec recalcul en direct des indicateurs et des cartes.</w:t>
+        <w:t xml:space="preserve"> : dashboard Streamlit permettant à Oxand d'explorer les résultats par département. Les hypothèses économiques sont </w:t>
+      </w:r>
+      <w:r>
+        <w:rPr>
+          <w:b/>
+        </w:rPr>
+        <w:t>fixes</w:t>
+      </w:r>
+      <w:r>
+        <w:t xml:space="preserve"> (celles de la note de cadrage) et affichées pour transparence ; l'utilisateur choisit le </w:t>
+      </w:r>
+      <w:r>
+        <w:rPr>
+          <w:b/>
+        </w:rPr>
+        <w:t>régime de valorisation</w:t>
+      </w:r>
+      <w:r>
+        <w:t xml:space="preserve"> (autoconsommation / vente) et la </w:t>
+      </w:r>
+      <w:r>
+        <w:rPr>
+          <w:b/>
+        </w:rPr>
+        <w:t>puissance</w:t>
+      </w:r>
+      <w:r>
+        <w:t xml:space="preserve"> de l'installation. Le dashboard présente les indicateurs nationaux, une carte choroplèthe, le détail par département avec un </w:t>
+      </w:r>
+      <w:r>
+        <w:rPr>
+          <w:b/>
+        </w:rPr>
+        <w:t>verdict de rentabilité</w:t>
+      </w:r>
+      <w:r>
+        <w:t>, une analyse de sensibilité et l'export des données en CSV.</w:t>
       </w:r>
     </w:p>
     <w:p>

</xml_diff>

<commit_message>
docs: ajout des liens dashboard deploye et depot GitHub (README, dossier technique, presentation)
</commit_message>
<xml_diff>
--- a/docs/exports/dossier-technique.docx
+++ b/docs/exports/dossier-technique.docx
@@ -1812,27 +1812,7 @@
         <w:t>En ligne</w:t>
       </w:r>
       <w:r>
-        <w:t xml:space="preserve"> : déployé sur Streamlit Community Cloud — </w:t>
-      </w:r>
-      <w:r>
-        <w:rPr>
-          <w:rFonts w:ascii="Consolas" w:hAnsi="Consolas"/>
-          <w:sz w:val="19"/>
-        </w:rPr>
-        <w:t>&lt;URL_A_COMPLETER_APRES_DEPLOIEMENT&gt;</w:t>
-      </w:r>
-      <w:r>
-        <w:t xml:space="preserve"> (voir aussi </w:t>
-      </w:r>
-      <w:r>
-        <w:rPr>
-          <w:rFonts w:ascii="Consolas" w:hAnsi="Consolas"/>
-          <w:sz w:val="19"/>
-        </w:rPr>
-        <w:t>README.md</w:t>
-      </w:r>
-      <w:r>
-        <w:t>).</w:t>
+        <w:t xml:space="preserve"> : &lt;https://imeneee01-workshop-client-3-streamlit-app-kzifeo.streamlit.app/&gt; (déployé sur Streamlit Community Cloud).</w:t>
       </w:r>
     </w:p>
     <w:p>
@@ -4513,7 +4493,7 @@
         <w:t>Code source</w:t>
       </w:r>
       <w:r>
-        <w:t xml:space="preserve"> : dépôt git du projet (racine du repository actuel).</w:t>
+        <w:t xml:space="preserve"> : &lt;https://github.com/imeneee01/workshop-client-3&gt;</w:t>
       </w:r>
     </w:p>
     <w:p>
@@ -4527,27 +4507,7 @@
         <w:t>Dashboard déployé</w:t>
       </w:r>
       <w:r>
-        <w:t xml:space="preserve"> : Streamlit Community Cloud — </w:t>
-      </w:r>
-      <w:r>
-        <w:rPr>
-          <w:rFonts w:ascii="Consolas" w:hAnsi="Consolas"/>
-          <w:sz w:val="19"/>
-        </w:rPr>
-        <w:t>&lt;URL_A_COMPLETER_APRES_DEPLOIEMENT&gt;</w:t>
-      </w:r>
-      <w:r>
-        <w:t xml:space="preserve"> (voir </w:t>
-      </w:r>
-      <w:r>
-        <w:rPr>
-          <w:rFonts w:ascii="Consolas" w:hAnsi="Consolas"/>
-          <w:sz w:val="19"/>
-        </w:rPr>
-        <w:t>README.md</w:t>
-      </w:r>
-      <w:r>
-        <w:t>, section « Dashboard interactif »).</w:t>
+        <w:t xml:space="preserve"> : &lt;https://imeneee01-workshop-client-3-streamlit-app-kzifeo.streamlit.app/&gt;</w:t>
       </w:r>
     </w:p>
     <w:p>

</xml_diff>

<commit_message>
docs: diagramme d'architecture en image dans le dossier technique (au lieu du code Mermaid)
</commit_message>
<xml_diff>
--- a/docs/exports/dossier-technique.docx
+++ b/docs/exports/dossier-technique.docx
@@ -864,7 +864,7 @@
               <w:rPr>
                 <w:sz w:val="19"/>
               </w:rPr>
-              <w:t xml:space="preserve"> (aucune logique métier propre), expose les hypothèses modifiables via une barre latérale (régime, puissance, OPEX, prix évité, taux d'autoconsommation, taux d'actualisation, multiplicateur CAPEX) et recalcule en direct les KPI nationaux, la carte choroplèthe, le détail par département et l'analyse de sensibilité.</w:t>
+              <w:t xml:space="preserve"> (aucune logique métier propre). Les hypothèses économiques sont fixes (celles de la note de cadrage) ; l'utilisateur choisit le régime de valorisation et la puissance, et le dashboard recalcule les KPI nationaux, la carte choroplèthe, le détail par département avec un verdict de rentabilité, et l'analyse de sensibilité.</w:t>
             </w:r>
           </w:p>
         </w:tc>
@@ -880,251 +880,52 @@
       </w:r>
     </w:p>
     <w:p>
+      <w:pPr>
+        <w:jc w:val="center"/>
+      </w:pPr>
+      <w:r>
+        <w:drawing>
+          <wp:inline xmlns:a="http://schemas.openxmlformats.org/drawingml/2006/main" xmlns:pic="http://schemas.openxmlformats.org/drawingml/2006/picture">
+            <wp:extent cx="5760000" cy="2979663"/>
+            <wp:docPr id="1" name="Picture 1"/>
+            <wp:cNvGraphicFramePr>
+              <a:graphicFrameLocks noChangeAspect="1"/>
+            </wp:cNvGraphicFramePr>
+            <a:graphic>
+              <a:graphicData uri="http://schemas.openxmlformats.org/drawingml/2006/picture">
+                <pic:pic>
+                  <pic:nvPicPr>
+                    <pic:cNvPr id="0" name="architecture.jpg"/>
+                    <pic:cNvPicPr/>
+                  </pic:nvPicPr>
+                  <pic:blipFill>
+                    <a:blip r:embed="rId9"/>
+                    <a:stretch>
+                      <a:fillRect/>
+                    </a:stretch>
+                  </pic:blipFill>
+                  <pic:spPr>
+                    <a:xfrm>
+                      <a:off x="0" y="0"/>
+                      <a:ext cx="5760000" cy="2979663"/>
+                    </a:xfrm>
+                    <a:prstGeom prst="rect"/>
+                  </pic:spPr>
+                </pic:pic>
+              </a:graphicData>
+            </a:graphic>
+          </wp:inline>
+        </w:drawing>
+      </w:r>
+    </w:p>
+    <w:p>
       <w:r>
         <w:rPr>
           <w:i/>
-          <w:color w:val="444444"/>
-          <w:sz w:val="20"/>
         </w:rPr>
-        <w:t>Diagramme (architecture) — rendu visuel dans la version Markdown / l’outil de gestion.</w:t>
+        <w:t>Le flux se lit de gauche à droite : les entrées (données réelles PVGIS/GeoJSON et hypothèses config/assumptions) alimentent la chaîne de traitement (gisement → dataset → economics → dashboard_data), qui produit la restitution (cartes, notebook, dashboard).</w:t>
       </w:r>
     </w:p>
-    <w:p>
-      <w:pPr>
-        <w:ind w:left="227"/>
-        <w:shd w:val="clear" w:color="auto" w:fill="F2F2F2"/>
-        <w:pBdr>
-          <w:top w:val="single" w:sz="4" w:space="4" w:color="CCCCCC"/>
-          <w:left w:val="single" w:sz="4" w:space="4" w:color="CCCCCC"/>
-          <w:bottom w:val="single" w:sz="4" w:space="4" w:color="CCCCCC"/>
-          <w:right w:val="single" w:sz="4" w:space="4" w:color="CCCCCC"/>
-        </w:pBdr>
-      </w:pPr>
-      <w:r>
-        <w:rPr>
-          <w:rFonts w:ascii="Consolas" w:hAnsi="Consolas"/>
-          <w:sz w:val="18"/>
-        </w:rPr>
-        <w:t>flowchart LR</w:t>
-        <w:br/>
-      </w:r>
-      <w:r>
-        <w:rPr>
-          <w:rFonts w:ascii="Consolas" w:hAnsi="Consolas"/>
-          <w:sz w:val="18"/>
-        </w:rPr>
-        <w:t xml:space="preserve">    subgraph Sources["Sources externes"]</w:t>
-        <w:br/>
-      </w:r>
-      <w:r>
-        <w:rPr>
-          <w:rFonts w:ascii="Consolas" w:hAnsi="Consolas"/>
-          <w:sz w:val="18"/>
-        </w:rPr>
-        <w:t xml:space="preserve">        GEOJSON["GeoJSON officiel\ndépartements (contours)"]</w:t>
-        <w:br/>
-      </w:r>
-      <w:r>
-        <w:rPr>
-          <w:rFonts w:ascii="Consolas" w:hAnsi="Consolas"/>
-          <w:sz w:val="18"/>
-        </w:rPr>
-        <w:t xml:space="preserve">        PVGIS["API PVGIS (JRC)\ngisement solaire réel"]</w:t>
-        <w:br/>
-      </w:r>
-      <w:r>
-        <w:rPr>
-          <w:rFonts w:ascii="Consolas" w:hAnsi="Consolas"/>
-          <w:sz w:val="18"/>
-        </w:rPr>
-        <w:t xml:space="preserve">    end</w:t>
-        <w:br/>
-      </w:r>
-      <w:r>
-        <w:rPr>
-          <w:rFonts w:ascii="Consolas" w:hAnsi="Consolas"/>
-          <w:sz w:val="18"/>
-        </w:rPr>
-        <w:t xml:space="preserve"> </w:t>
-        <w:br/>
-      </w:r>
-      <w:r>
-        <w:rPr>
-          <w:rFonts w:ascii="Consolas" w:hAnsi="Consolas"/>
-          <w:sz w:val="18"/>
-        </w:rPr>
-        <w:t xml:space="preserve">    subgraph Hypotheses["Hypothèses"]</w:t>
-        <w:br/>
-      </w:r>
-      <w:r>
-        <w:rPr>
-          <w:rFonts w:ascii="Consolas" w:hAnsi="Consolas"/>
-          <w:sz w:val="18"/>
-        </w:rPr>
-        <w:t xml:space="preserve">        CONFIG["config.py\n(CAPEX, OPEX, tarifs S21,\ntaux autoconso, taux actualisation)"]</w:t>
-        <w:br/>
-      </w:r>
-      <w:r>
-        <w:rPr>
-          <w:rFonts w:ascii="Consolas" w:hAnsi="Consolas"/>
-          <w:sz w:val="18"/>
-        </w:rPr>
-        <w:t xml:space="preserve">        ASSUMP["assumptions.py\n(dataclass Assumptions,\nmodifiable à chaud)"]</w:t>
-        <w:br/>
-      </w:r>
-      <w:r>
-        <w:rPr>
-          <w:rFonts w:ascii="Consolas" w:hAnsi="Consolas"/>
-          <w:sz w:val="18"/>
-        </w:rPr>
-        <w:t xml:space="preserve">    end</w:t>
-        <w:br/>
-      </w:r>
-      <w:r>
-        <w:rPr>
-          <w:rFonts w:ascii="Consolas" w:hAnsi="Consolas"/>
-          <w:sz w:val="18"/>
-        </w:rPr>
-        <w:t xml:space="preserve"> </w:t>
-        <w:br/>
-      </w:r>
-      <w:r>
-        <w:rPr>
-          <w:rFonts w:ascii="Consolas" w:hAnsi="Consolas"/>
-          <w:sz w:val="18"/>
-        </w:rPr>
-        <w:t xml:space="preserve">    GEOJSON --&gt; DATASET["dataset.py\ncentroïdes Lambert-93\n+ fusion gisement"]</w:t>
-        <w:br/>
-      </w:r>
-      <w:r>
-        <w:rPr>
-          <w:rFonts w:ascii="Consolas" w:hAnsi="Consolas"/>
-          <w:sz w:val="18"/>
-        </w:rPr>
-        <w:t xml:space="preserve">    PVGIS --&gt; GISEMENT["gisement.py\ncache + fallback\nsynthétique"]</w:t>
-        <w:br/>
-      </w:r>
-      <w:r>
-        <w:rPr>
-          <w:rFonts w:ascii="Consolas" w:hAnsi="Consolas"/>
-          <w:sz w:val="18"/>
-        </w:rPr>
-        <w:t xml:space="preserve">    GISEMENT --&gt; DATASET</w:t>
-        <w:br/>
-      </w:r>
-      <w:r>
-        <w:rPr>
-          <w:rFonts w:ascii="Consolas" w:hAnsi="Consolas"/>
-          <w:sz w:val="18"/>
-        </w:rPr>
-        <w:t xml:space="preserve">    DATASET --&gt; CSV["data/processed/\ndepartements_pv.csv\n(1 ligne = 1 département)"]</w:t>
-        <w:br/>
-      </w:r>
-      <w:r>
-        <w:rPr>
-          <w:rFonts w:ascii="Consolas" w:hAnsi="Consolas"/>
-          <w:sz w:val="18"/>
-        </w:rPr>
-        <w:t xml:space="preserve"> </w:t>
-        <w:br/>
-      </w:r>
-      <w:r>
-        <w:rPr>
-          <w:rFonts w:ascii="Consolas" w:hAnsi="Consolas"/>
-          <w:sz w:val="18"/>
-        </w:rPr>
-        <w:t xml:space="preserve">    CONFIG --&gt; ASSUMP</w:t>
-        <w:br/>
-      </w:r>
-      <w:r>
-        <w:rPr>
-          <w:rFonts w:ascii="Consolas" w:hAnsi="Consolas"/>
-          <w:sz w:val="18"/>
-        </w:rPr>
-        <w:t xml:space="preserve">    CSV --&gt; ECO["economics.py\nLCOE / payback / TRI / VAN"]</w:t>
-        <w:br/>
-      </w:r>
-      <w:r>
-        <w:rPr>
-          <w:rFonts w:ascii="Consolas" w:hAnsi="Consolas"/>
-          <w:sz w:val="18"/>
-        </w:rPr>
-        <w:t xml:space="preserve">    ASSUMP --&gt; ECO</w:t>
-        <w:br/>
-      </w:r>
-      <w:r>
-        <w:rPr>
-          <w:rFonts w:ascii="Consolas" w:hAnsi="Consolas"/>
-          <w:sz w:val="18"/>
-        </w:rPr>
-        <w:t xml:space="preserve">    ECO --&gt; DD["dashboard_data.py\ncompute_indicators"]</w:t>
-        <w:br/>
-      </w:r>
-      <w:r>
-        <w:rPr>
-          <w:rFonts w:ascii="Consolas" w:hAnsi="Consolas"/>
-          <w:sz w:val="18"/>
-        </w:rPr>
-        <w:t xml:space="preserve">    CSV --&gt; DD</w:t>
-        <w:br/>
-      </w:r>
-      <w:r>
-        <w:rPr>
-          <w:rFonts w:ascii="Consolas" w:hAnsi="Consolas"/>
-          <w:sz w:val="18"/>
-        </w:rPr>
-        <w:t xml:space="preserve"> </w:t>
-        <w:br/>
-      </w:r>
-      <w:r>
-        <w:rPr>
-          <w:rFonts w:ascii="Consolas" w:hAnsi="Consolas"/>
-          <w:sz w:val="18"/>
-        </w:rPr>
-        <w:t xml:space="preserve">    DD --&gt; VIZ["viz.py\ncartes choroplèthes,\ngraphiques"]</w:t>
-        <w:br/>
-      </w:r>
-      <w:r>
-        <w:rPr>
-          <w:rFonts w:ascii="Consolas" w:hAnsi="Consolas"/>
-          <w:sz w:val="18"/>
-        </w:rPr>
-        <w:t xml:space="preserve">    DD --&gt; NOTEBOOK["notebooks/\nanalyse_pv_france.ipynb"]</w:t>
-        <w:br/>
-      </w:r>
-      <w:r>
-        <w:rPr>
-          <w:rFonts w:ascii="Consolas" w:hAnsi="Consolas"/>
-          <w:sz w:val="18"/>
-        </w:rPr>
-        <w:t xml:space="preserve">    VIZ --&gt; NOTEBOOK</w:t>
-        <w:br/>
-      </w:r>
-      <w:r>
-        <w:rPr>
-          <w:rFonts w:ascii="Consolas" w:hAnsi="Consolas"/>
-          <w:sz w:val="18"/>
-        </w:rPr>
-        <w:t xml:space="preserve">    VIZ --&gt; APP["streamlit_app.py\ndashboard interactif"]</w:t>
-        <w:br/>
-      </w:r>
-      <w:r>
-        <w:rPr>
-          <w:rFonts w:ascii="Consolas" w:hAnsi="Consolas"/>
-          <w:sz w:val="18"/>
-        </w:rPr>
-        <w:t xml:space="preserve">    DD --&gt; APP</w:t>
-        <w:br/>
-      </w:r>
-      <w:r>
-        <w:rPr>
-          <w:rFonts w:ascii="Consolas" w:hAnsi="Consolas"/>
-          <w:sz w:val="18"/>
-        </w:rPr>
-        <w:t xml:space="preserve">    ASSUMP --&gt; APP</w:t>
-      </w:r>
-    </w:p>
-    <w:p/>
     <w:p>
       <w:r>
         <w:t xml:space="preserve">La règle d'architecture centrale : </w:t>

</xml_diff>